<commit_message>
Add CP entitlement balance into agreements enquiry module
</commit_message>
<xml_diff>
--- a/UAT-SignOff-Form v1.0.docx
+++ b/UAT-SignOff-Form v1.0.docx
@@ -1282,7 +1282,7 @@
               <w:sdtContent>
                 <w:r>
                   <w:rPr>
-                    <w:rFonts w:ascii="MS Gothic" w:eastAsia="MS Gothic" w:hAnsi="MS Gothic"/>
+                    <w:rFonts w:ascii="MS Gothic" w:eastAsia="MS Gothic" w:hAnsi="MS Gothic" w:hint="eastAsia"/>
                     <w:sz w:val="24"/>
                   </w:rPr>
                   <w:t>☐</w:t>
@@ -1331,6 +1331,117 @@
           <w:p/>
         </w:tc>
       </w:tr>
+      <w:tr>
+        <w:trPr>
+          <w:jc w:val="center"/>
+        </w:trPr>
+        <w:tc>
+          <w:tcPr>
+            <w:tcW w:w="560" w:type="dxa"/>
+          </w:tcPr>
+          <w:p>
+            <w:pPr>
+              <w:jc w:val="center"/>
+            </w:pPr>
+            <w:r>
+              <w:t>2.7</w:t>
+            </w:r>
+          </w:p>
+        </w:tc>
+        <w:tc>
+          <w:tcPr>
+            <w:tcW w:w="4576" w:type="dxa"/>
+          </w:tcPr>
+          <w:p>
+            <w:r>
+              <w:t xml:space="preserve">Entitlement balance for CP and LHC – the accrue, current and advance year balances </w:t>
+            </w:r>
+            <w:r>
+              <w:t>are accurate as per SIS</w:t>
+            </w:r>
+          </w:p>
+        </w:tc>
+        <w:tc>
+          <w:tcPr>
+            <w:tcW w:w="820" w:type="dxa"/>
+          </w:tcPr>
+          <w:p>
+            <w:pPr>
+              <w:jc w:val="center"/>
+              <w:rPr>
+                <w:rFonts w:ascii="MS Gothic" w:eastAsia="MS Gothic" w:hAnsi="MS Gothic"/>
+                <w:sz w:val="24"/>
+              </w:rPr>
+            </w:pPr>
+            <w:sdt>
+              <w:sdtPr>
+                <w:rPr>
+                  <w:rFonts w:ascii="MS Gothic" w:eastAsia="MS Gothic" w:hAnsi="MS Gothic"/>
+                  <w:sz w:val="24"/>
+                </w:rPr>
+                <w:id w:val="1632674282"/>
+                <w14:checkbox>
+                  <w14:checked w14:val="0"/>
+                  <w14:checkedState w14:val="2612" w14:font="MS Gothic"/>
+                  <w14:uncheckedState w14:val="2610" w14:font="MS Gothic"/>
+                </w14:checkbox>
+              </w:sdtPr>
+              <w:sdtContent>
+                <w:r>
+                  <w:rPr>
+                    <w:rFonts w:ascii="MS Gothic" w:eastAsia="MS Gothic" w:hAnsi="MS Gothic" w:hint="eastAsia"/>
+                    <w:sz w:val="24"/>
+                  </w:rPr>
+                  <w:t>☐</w:t>
+                </w:r>
+              </w:sdtContent>
+            </w:sdt>
+          </w:p>
+        </w:tc>
+        <w:tc>
+          <w:tcPr>
+            <w:tcW w:w="808" w:type="dxa"/>
+          </w:tcPr>
+          <w:p>
+            <w:pPr>
+              <w:jc w:val="center"/>
+              <w:rPr>
+                <w:rFonts w:ascii="MS Gothic" w:eastAsia="MS Gothic" w:hAnsi="MS Gothic"/>
+                <w:sz w:val="24"/>
+              </w:rPr>
+            </w:pPr>
+            <w:sdt>
+              <w:sdtPr>
+                <w:rPr>
+                  <w:rFonts w:ascii="MS Gothic" w:eastAsia="MS Gothic" w:hAnsi="MS Gothic"/>
+                  <w:sz w:val="24"/>
+                </w:rPr>
+                <w:id w:val="-181364698"/>
+                <w14:checkbox>
+                  <w14:checked w14:val="0"/>
+                  <w14:checkedState w14:val="2612" w14:font="MS Gothic"/>
+                  <w14:uncheckedState w14:val="2610" w14:font="MS Gothic"/>
+                </w14:checkbox>
+              </w:sdtPr>
+              <w:sdtContent>
+                <w:r>
+                  <w:rPr>
+                    <w:rFonts w:ascii="MS Gothic" w:eastAsia="MS Gothic" w:hAnsi="MS Gothic"/>
+                    <w:sz w:val="24"/>
+                  </w:rPr>
+                  <w:t>☐</w:t>
+                </w:r>
+              </w:sdtContent>
+            </w:sdt>
+          </w:p>
+        </w:tc>
+        <w:tc>
+          <w:tcPr>
+            <w:tcW w:w="2092" w:type="dxa"/>
+          </w:tcPr>
+          <w:p/>
+        </w:tc>
+      </w:tr>
     </w:tbl>
     <w:p/>
     <w:p>
@@ -1343,6 +1454,7 @@
           <w:color w:val="1F4E79"/>
           <w:sz w:val="24"/>
         </w:rPr>
+        <w:lastRenderedPageBreak/>
         <w:t>3. AMC Billing</w:t>
       </w:r>
     </w:p>
@@ -1379,7 +1491,6 @@
                 <w:b/>
                 <w:color w:val="FFFFFF"/>
               </w:rPr>
-              <w:lastRenderedPageBreak/>
               <w:t>#</w:t>
             </w:r>
           </w:p>
@@ -3041,6 +3152,7 @@
         <w:rPr>
           <w:b/>
         </w:rPr>
+        <w:lastRenderedPageBreak/>
         <w:t xml:space="preserve">UAT Result:    </w:t>
       </w:r>
       <w:sdt>

</xml_diff>

<commit_message>
To enable user access control for " PBS Auto Transfer To Claim"
</commit_message>
<xml_diff>
--- a/UAT-SignOff-Form v1.0.docx
+++ b/UAT-SignOff-Form v1.0.docx
@@ -1354,10 +1354,7 @@
           </w:tcPr>
           <w:p>
             <w:r>
-              <w:t xml:space="preserve">Entitlement balance for CP and LHC – the accrue, current and advance year balances </w:t>
-            </w:r>
-            <w:r>
-              <w:t>are accurate as per SIS</w:t>
+              <w:t>Entitlement balance for CP and LHC – the accrue, current and advance year balances are accurate as per SIS</w:t>
             </w:r>
           </w:p>
         </w:tc>
@@ -3152,7 +3149,6 @@
         <w:rPr>
           <w:b/>
         </w:rPr>
-        <w:lastRenderedPageBreak/>
         <w:t xml:space="preserve">UAT Result:    </w:t>
       </w:r>
       <w:sdt>
@@ -3237,7 +3233,7 @@
     <w:sectPr>
       <w:headerReference w:type="default" r:id="rId8"/>
       <w:pgSz w:w="12240" w:h="15840"/>
-      <w:pgMar w:top="1440" w:right="1800" w:bottom="1440" w:left="1800" w:header="720" w:footer="720" w:gutter="0"/>
+      <w:pgMar w:top="1120" w:right="1800" w:bottom="993" w:left="1800" w:header="720" w:footer="720" w:gutter="0"/>
       <w:cols w:space="720"/>
       <w:docGrid w:linePitch="360"/>
     </w:sectPr>
@@ -3310,7 +3306,7 @@
         <wp:inline distT="0" distB="0" distL="0" distR="0" wp14:anchorId="282026D0" wp14:editId="1FD08A08">
           <wp:extent cx="1536469" cy="426085"/>
           <wp:effectExtent l="0" t="0" r="6985" b="0"/>
-          <wp:docPr id="1181075212" name="Picture 1"/>
+          <wp:docPr id="613116804" name="Picture 1"/>
           <wp:cNvGraphicFramePr>
             <a:graphicFrameLocks xmlns:a="http://schemas.openxmlformats.org/drawingml/2006/main" noChangeAspect="1"/>
           </wp:cNvGraphicFramePr>

</xml_diff>